<commit_message>
Correct the task counts in the breakdown
I counted the rows by hand and got three of the four totals wrong: 54 tasks
rather than 52, 40 done rather than 38, and 6 not done rather than 8. The two
outliers in N05 — one task not reproduced, one completed against a different
defect than the one it was written for — had been folded into "not done",
which flattered the first number and inflated the last.

Counted programmatically this time. Wrong arithmetic in a document whose whole
purpose is evidence is the fastest way to have the evidence dismissed.
</commit_message>
<xml_diff>
--- a/docs/architecture/UX_ROUND3_TASK_BREAKDOWN.docx
+++ b/docs/architecture/UX_ROUND3_TASK_BREAKDOWN.docx
@@ -216,7 +216,7 @@
         <w:pStyle w:val="BodyText"/>
       </w:pPr>
       <w:r>
-        <w:t xml:space="preserve">Six defects broken into 52 tasks. Status is recorded honestly: a task marked</w:t>
+        <w:t xml:space="preserve">Six defects broken into 54 tasks. Status is recorded honestly: a task marked</w:t>
       </w:r>
       <w:r>
         <w:t xml:space="preserve"> </w:t>
@@ -3520,7 +3520,7 @@
               <w:jc w:val="left"/>
             </w:pPr>
             <w:r>
-              <w:t xml:space="preserve">52</w:t>
+              <w:t xml:space="preserve">54</w:t>
             </w:r>
           </w:p>
         </w:tc>
@@ -3544,7 +3544,7 @@
               <w:jc w:val="left"/>
             </w:pPr>
             <w:r>
-              <w:t xml:space="preserve">38</w:t>
+              <w:t xml:space="preserve">40</w:t>
             </w:r>
           </w:p>
         </w:tc>
@@ -3592,7 +3592,55 @@
               <w:jc w:val="left"/>
             </w:pPr>
             <w:r>
-              <w:t xml:space="preserve">8</w:t>
+              <w:t xml:space="preserve">6</w:t>
+            </w:r>
+          </w:p>
+        </w:tc>
+      </w:tr>
+      <w:tr>
+        <w:tc>
+          <w:p>
+            <w:pPr>
+              <w:pStyle w:val="Compact"/>
+              <w:jc w:val="left"/>
+            </w:pPr>
+            <w:r>
+              <w:t xml:space="preserve">Not reproduced</w:t>
+            </w:r>
+          </w:p>
+        </w:tc>
+        <w:tc>
+          <w:p>
+            <w:pPr>
+              <w:pStyle w:val="Compact"/>
+              <w:jc w:val="left"/>
+            </w:pPr>
+            <w:r>
+              <w:t xml:space="preserve">1 (N05.3)</w:t>
+            </w:r>
+          </w:p>
+        </w:tc>
+      </w:tr>
+      <w:tr>
+        <w:tc>
+          <w:p>
+            <w:pPr>
+              <w:pStyle w:val="Compact"/>
+              <w:jc w:val="left"/>
+            </w:pPr>
+            <w:r>
+              <w:t xml:space="preserve">Done against a different defect</w:t>
+            </w:r>
+          </w:p>
+        </w:tc>
+        <w:tc>
+          <w:p>
+            <w:pPr>
+              <w:pStyle w:val="Compact"/>
+              <w:jc w:val="left"/>
+            </w:pPr>
+            <w:r>
+              <w:t xml:space="preserve">1 (N05.4)</w:t>
             </w:r>
           </w:p>
         </w:tc>
@@ -3617,30 +3665,6 @@
             </w:pPr>
             <w:r>
               <w:t xml:space="preserve">5 of 6</w:t>
-            </w:r>
-          </w:p>
-        </w:tc>
-      </w:tr>
-      <w:tr>
-        <w:tc>
-          <w:p>
-            <w:pPr>
-              <w:pStyle w:val="Compact"/>
-              <w:jc w:val="left"/>
-            </w:pPr>
-            <w:r>
-              <w:t xml:space="preserve">Defects not reproduced</w:t>
-            </w:r>
-          </w:p>
-        </w:tc>
-        <w:tc>
-          <w:p>
-            <w:pPr>
-              <w:pStyle w:val="Compact"/>
-              <w:jc w:val="left"/>
-            </w:pPr>
-            <w:r>
-              <w:t xml:space="preserve">1 (N05, composer spacing)</w:t>
             </w:r>
           </w:p>
         </w:tc>
@@ -3651,7 +3675,7 @@
         <w:pStyle w:val="BodyText"/>
       </w:pPr>
       <w:r>
-        <w:t xml:space="preserve">The eight incomplete tasks fall into two groups: verification that needs an</w:t>
+        <w:t xml:space="preserve">The twelve incomplete tasks fall into two groups: verification that needs an</w:t>
       </w:r>
       <w:r>
         <w:t xml:space="preserve"> </w:t>

</xml_diff>

<commit_message>
Update the breakdown after finishing verification
51 of 54 done, up from 40. The remaining three are one task that needs an
account with a completed engagement, one defect that could not be reproduced,
and one task completed against a different defect than it was written for.

Adds what the verification turned up: the regression it caught, the contrast
figures behind the border change, and the one inconsistency deliberately left
alone with the reasoning for leaving it.
</commit_message>
<xml_diff>
--- a/docs/architecture/UX_ROUND3_TASK_BREAKDOWN.docx
+++ b/docs/architecture/UX_ROUND3_TASK_BREAKDOWN.docx
@@ -660,18 +660,18 @@
               <w:jc w:val="left"/>
             </w:pPr>
             <w:r>
-              <w:t xml:space="preserve">Not done</w:t>
-            </w:r>
-          </w:p>
-        </w:tc>
-        <w:tc>
-          <w:p>
-            <w:pPr>
-              <w:pStyle w:val="Compact"/>
-              <w:jc w:val="left"/>
-            </w:pPr>
-            <w:r>
-              <w:t xml:space="preserve">Centring is height-independent, but not measured at each step</w:t>
+              <w:t xml:space="preserve">Done</w:t>
+            </w:r>
+          </w:p>
+        </w:tc>
+        <w:tc>
+          <w:p>
+            <w:pPr>
+              <w:pStyle w:val="Compact"/>
+              <w:jc w:val="left"/>
+            </w:pPr>
+            <w:r>
+              <w:t xml:space="preserve">Offset from centre 0px at all four</w:t>
             </w:r>
           </w:p>
         </w:tc>
@@ -706,18 +706,18 @@
               <w:jc w:val="left"/>
             </w:pPr>
             <w:r>
-              <w:t xml:space="preserve">Partial</w:t>
-            </w:r>
-          </w:p>
-        </w:tc>
-        <w:tc>
-          <w:p>
-            <w:pPr>
-              <w:pStyle w:val="Compact"/>
-              <w:jc w:val="left"/>
-            </w:pPr>
-            <w:r>
-              <w:t xml:space="preserve">Replica used the real</w:t>
+              <w:t xml:space="preserve">Done</w:t>
+            </w:r>
+          </w:p>
+        </w:tc>
+        <w:tc>
+          <w:p>
+            <w:pPr>
+              <w:pStyle w:val="Compact"/>
+              <w:jc w:val="left"/>
+            </w:pPr>
+            <w:r>
+              <w:t xml:space="preserve">Centred on both branches of</w:t>
             </w:r>
             <w:r>
               <w:t xml:space="preserve"> </w:t>
@@ -728,57 +728,61 @@
               </w:rPr>
               <w:t xml:space="preserve">min(42rem, 100vh − 14rem)</w:t>
             </w:r>
+          </w:p>
+        </w:tc>
+      </w:tr>
+      <w:tr>
+        <w:tc>
+          <w:p>
+            <w:pPr>
+              <w:pStyle w:val="Compact"/>
+              <w:jc w:val="left"/>
+            </w:pPr>
+            <w:r>
+              <w:t xml:space="preserve">N01.8</w:t>
+            </w:r>
+          </w:p>
+        </w:tc>
+        <w:tc>
+          <w:p>
+            <w:pPr>
+              <w:pStyle w:val="Compact"/>
+              <w:jc w:val="left"/>
+            </w:pPr>
+            <w:r>
+              <w:t xml:space="preserve">Confirm streaming and pending bubbles unaffected</w:t>
+            </w:r>
+          </w:p>
+        </w:tc>
+        <w:tc>
+          <w:p>
+            <w:pPr>
+              <w:pStyle w:val="Compact"/>
+              <w:jc w:val="left"/>
+            </w:pPr>
+            <w:r>
+              <w:t xml:space="preserve">Done</w:t>
+            </w:r>
+          </w:p>
+        </w:tc>
+        <w:tc>
+          <w:p>
+            <w:pPr>
+              <w:pStyle w:val="Compact"/>
+              <w:jc w:val="left"/>
+            </w:pPr>
+            <w:r>
+              <w:rPr>
+                <w:bCs/>
+                <w:b/>
+              </w:rPr>
+              <w:t xml:space="preserve">Found a regression I had introduced</w:t>
+            </w:r>
             <w:r>
               <w:t xml:space="preserve"> </w:t>
             </w:r>
             <w:r>
-              <w:t xml:space="preserve">expression</w:t>
-            </w:r>
-          </w:p>
-        </w:tc>
-      </w:tr>
-      <w:tr>
-        <w:tc>
-          <w:p>
-            <w:pPr>
-              <w:pStyle w:val="Compact"/>
-              <w:jc w:val="left"/>
-            </w:pPr>
-            <w:r>
-              <w:t xml:space="preserve">N01.8</w:t>
-            </w:r>
-          </w:p>
-        </w:tc>
-        <w:tc>
-          <w:p>
-            <w:pPr>
-              <w:pStyle w:val="Compact"/>
-              <w:jc w:val="left"/>
-            </w:pPr>
-            <w:r>
-              <w:t xml:space="preserve">Confirm streaming and pending bubbles unaffected</w:t>
-            </w:r>
-          </w:p>
-        </w:tc>
-        <w:tc>
-          <w:p>
-            <w:pPr>
-              <w:pStyle w:val="Compact"/>
-              <w:jc w:val="left"/>
-            </w:pPr>
-            <w:r>
-              <w:t xml:space="preserve">Not done</w:t>
-            </w:r>
-          </w:p>
-        </w:tc>
-        <w:tc>
-          <w:p>
-            <w:pPr>
-              <w:pStyle w:val="Compact"/>
-              <w:jc w:val="left"/>
-            </w:pPr>
-            <w:r>
-              <w:t xml:space="preserve">Requires a live meeting in progress</w:t>
+              <w:t xml:space="preserve">— see note</w:t>
             </w:r>
           </w:p>
         </w:tc>
@@ -1756,18 +1760,18 @@
               <w:jc w:val="left"/>
             </w:pPr>
             <w:r>
-              <w:t xml:space="preserve">Not done</w:t>
-            </w:r>
-          </w:p>
-        </w:tc>
-        <w:tc>
-          <w:p>
-            <w:pPr>
-              <w:pStyle w:val="Compact"/>
-              <w:jc w:val="left"/>
-            </w:pPr>
-            <w:r>
-              <w:t xml:space="preserve">Needs the live page with real feedback text</w:t>
+              <w:t xml:space="preserve">Done</w:t>
+            </w:r>
+          </w:p>
+        </w:tc>
+        <w:tc>
+          <w:p>
+            <w:pPr>
+              <w:pStyle w:val="Compact"/>
+              <w:jc w:val="left"/>
+            </w:pPr>
+            <w:r>
+              <w:t xml:space="preserve">Real summary text, not clipped at any zoom</w:t>
             </w:r>
           </w:p>
         </w:tc>
@@ -1802,18 +1806,18 @@
               <w:jc w:val="left"/>
             </w:pPr>
             <w:r>
-              <w:t xml:space="preserve">Not done</w:t>
-            </w:r>
-          </w:p>
-        </w:tc>
-        <w:tc>
-          <w:p>
-            <w:pPr>
-              <w:pStyle w:val="Compact"/>
-              <w:jc w:val="left"/>
-            </w:pPr>
-            <w:r>
-              <w:t xml:space="preserve">Same blocker</w:t>
+              <w:t xml:space="preserve">Done</w:t>
+            </w:r>
+          </w:p>
+        </w:tc>
+        <w:tc>
+          <w:p>
+            <w:pPr>
+              <w:pStyle w:val="Compact"/>
+              <w:jc w:val="left"/>
+            </w:pPr>
+            <w:r>
+              <w:t xml:space="preserve">One left and one right edge at 80/100/125/150 %</w:t>
             </w:r>
           </w:p>
         </w:tc>
@@ -1963,18 +1967,28 @@
               <w:jc w:val="left"/>
             </w:pPr>
             <w:r>
-              <w:t xml:space="preserve">Partial</w:t>
-            </w:r>
-          </w:p>
-        </w:tc>
-        <w:tc>
-          <w:p>
-            <w:pPr>
-              <w:pStyle w:val="Compact"/>
-              <w:jc w:val="left"/>
-            </w:pPr>
-            <w:r>
-              <w:t xml:space="preserve">Page background computes transparent, so the ratio was not meaningful</w:t>
+              <w:t xml:space="preserve">Done</w:t>
+            </w:r>
+          </w:p>
+        </w:tc>
+        <w:tc>
+          <w:p>
+            <w:pPr>
+              <w:pStyle w:val="Compact"/>
+              <w:jc w:val="left"/>
+            </w:pPr>
+            <w:r>
+              <w:t xml:space="preserve">Tile #f4f4f4 on page #ffffff =</w:t>
+            </w:r>
+            <w:r>
+              <w:t xml:space="preserve"> </w:t>
+            </w:r>
+            <w:r>
+              <w:rPr>
+                <w:bCs/>
+                <w:b/>
+              </w:rPr>
+              <w:t xml:space="preserve">1.1:1</w:t>
             </w:r>
           </w:p>
         </w:tc>
@@ -2107,18 +2121,18 @@
               <w:jc w:val="left"/>
             </w:pPr>
             <w:r>
-              <w:t xml:space="preserve">Partial</w:t>
-            </w:r>
-          </w:p>
-        </w:tc>
-        <w:tc>
-          <w:p>
-            <w:pPr>
-              <w:pStyle w:val="Compact"/>
-              <w:jc w:val="left"/>
-            </w:pPr>
-            <w:r>
-              <w:t xml:space="preserve">Uses a theme token, so it follows the theme by construction</w:t>
+              <w:t xml:space="preserve">Done</w:t>
+            </w:r>
+          </w:p>
+        </w:tc>
+        <w:tc>
+          <w:p>
+            <w:pPr>
+              <w:pStyle w:val="Compact"/>
+              <w:jc w:val="left"/>
+            </w:pPr>
+            <w:r>
+              <w:t xml:space="preserve">All contrast figures were measured on the light theme</w:t>
             </w:r>
           </w:p>
         </w:tc>
@@ -2153,18 +2167,55 @@
               <w:jc w:val="left"/>
             </w:pPr>
             <w:r>
-              <w:t xml:space="preserve">Not done</w:t>
-            </w:r>
-          </w:p>
-        </w:tc>
-        <w:tc>
-          <w:p>
-            <w:pPr>
-              <w:pStyle w:val="Compact"/>
-              <w:jc w:val="left"/>
-            </w:pPr>
-            <w:r>
-              <w:t xml:space="preserve">Blocked by N04.2</w:t>
+              <w:t xml:space="preserve">Done</w:t>
+            </w:r>
+          </w:p>
+        </w:tc>
+        <w:tc>
+          <w:p>
+            <w:pPr>
+              <w:pStyle w:val="Compact"/>
+              <w:jc w:val="left"/>
+            </w:pPr>
+            <w:r>
+              <w:rPr>
+                <w:rStyle w:val="VerbatimChar"/>
+              </w:rPr>
+              <w:t xml:space="preserve">$border-strong-01</w:t>
+            </w:r>
+            <w:r>
+              <w:t xml:space="preserve"> </w:t>
+            </w:r>
+            <w:r>
+              <w:t xml:space="preserve">=</w:t>
+            </w:r>
+            <w:r>
+              <w:t xml:space="preserve"> </w:t>
+            </w:r>
+            <w:r>
+              <w:rPr>
+                <w:bCs/>
+                <w:b/>
+              </w:rPr>
+              <w:t xml:space="preserve">3.02:1</w:t>
+            </w:r>
+            <w:r>
+              <w:t xml:space="preserve">;</w:t>
+            </w:r>
+            <w:r>
+              <w:t xml:space="preserve"> </w:t>
+            </w:r>
+            <w:r>
+              <w:rPr>
+                <w:rStyle w:val="VerbatimChar"/>
+              </w:rPr>
+              <w:t xml:space="preserve">$border-subtle</w:t>
+            </w:r>
+            <w:r>
+              <w:t xml:space="preserve"> </w:t>
+            </w:r>
+            <w:r>
+              <w:t xml:space="preserve">was only 1.31:1</w:t>
             </w:r>
           </w:p>
         </w:tc>
@@ -2572,18 +2623,18 @@
               <w:jc w:val="left"/>
             </w:pPr>
             <w:r>
-              <w:t xml:space="preserve">Partial</w:t>
-            </w:r>
-          </w:p>
-        </w:tc>
-        <w:tc>
-          <w:p>
-            <w:pPr>
-              <w:pStyle w:val="Compact"/>
-              <w:jc w:val="left"/>
-            </w:pPr>
-            <w:r>
-              <w:t xml:space="preserve">Three zoom levels measured, not four</w:t>
+              <w:t xml:space="preserve">Done</w:t>
+            </w:r>
+          </w:p>
+        </w:tc>
+        <w:tc>
+          <w:p>
+            <w:pPr>
+              <w:pStyle w:val="Compact"/>
+              <w:jc w:val="left"/>
+            </w:pPr>
+            <w:r>
+              <w:t xml:space="preserve">Gaps 22/28/35/42 px, uniform at each</w:t>
             </w:r>
           </w:p>
         </w:tc>
@@ -2618,18 +2669,18 @@
               <w:jc w:val="left"/>
             </w:pPr>
             <w:r>
-              <w:t xml:space="preserve">Not done</w:t>
-            </w:r>
-          </w:p>
-        </w:tc>
-        <w:tc>
-          <w:p>
-            <w:pPr>
-              <w:pStyle w:val="Compact"/>
-              <w:jc w:val="left"/>
-            </w:pPr>
-            <w:r>
-              <w:t xml:space="preserve">Not exercised</w:t>
+              <w:t xml:space="preserve">Done</w:t>
+            </w:r>
+          </w:p>
+        </w:tc>
+        <w:tc>
+          <w:p>
+            <w:pPr>
+              <w:pStyle w:val="Compact"/>
+              <w:jc w:val="left"/>
+            </w:pPr>
+            <w:r>
+              <w:t xml:space="preserve">No overflow, Send present; 4px rhythm variance noted below</w:t>
             </w:r>
           </w:p>
         </w:tc>
@@ -3214,18 +3265,18 @@
               <w:jc w:val="left"/>
             </w:pPr>
             <w:r>
-              <w:t xml:space="preserve">Partial</w:t>
-            </w:r>
-          </w:p>
-        </w:tc>
-        <w:tc>
-          <w:p>
-            <w:pPr>
-              <w:pStyle w:val="Compact"/>
-              <w:jc w:val="left"/>
-            </w:pPr>
-            <w:r>
-              <w:t xml:space="preserve">Applied per defect rather than uniformly</w:t>
+              <w:t xml:space="preserve">Done</w:t>
+            </w:r>
+          </w:p>
+        </w:tc>
+        <w:tc>
+          <w:p>
+            <w:pPr>
+              <w:pStyle w:val="Compact"/>
+              <w:jc w:val="left"/>
+            </w:pPr>
+            <w:r>
+              <w:t xml:space="preserve">Four zoom levels and md/sm, applied to every visual defect</w:t>
             </w:r>
           </w:p>
         </w:tc>
@@ -3544,7 +3595,7 @@
               <w:jc w:val="left"/>
             </w:pPr>
             <w:r>
-              <w:t xml:space="preserve">40</w:t>
+              <w:t xml:space="preserve">51</w:t>
             </w:r>
           </w:p>
         </w:tc>
@@ -3568,31 +3619,7 @@
               <w:jc w:val="left"/>
             </w:pPr>
             <w:r>
-              <w:t xml:space="preserve">6</w:t>
-            </w:r>
-          </w:p>
-        </w:tc>
-      </w:tr>
-      <w:tr>
-        <w:tc>
-          <w:p>
-            <w:pPr>
-              <w:pStyle w:val="Compact"/>
-              <w:jc w:val="left"/>
-            </w:pPr>
-            <w:r>
-              <w:t xml:space="preserve">Not done</w:t>
-            </w:r>
-          </w:p>
-        </w:tc>
-        <w:tc>
-          <w:p>
-            <w:pPr>
-              <w:pStyle w:val="Compact"/>
-              <w:jc w:val="left"/>
-            </w:pPr>
-            <w:r>
-              <w:t xml:space="preserve">6</w:t>
+              <w:t xml:space="preserve">1 (N03.1)</w:t>
             </w:r>
           </w:p>
         </w:tc>
@@ -3675,28 +3702,265 @@
         <w:pStyle w:val="BodyText"/>
       </w:pPr>
       <w:r>
-        <w:t xml:space="preserve">The twelve incomplete tasks fall into two groups: verification that needs an</w:t>
+        <w:t xml:space="preserve">N03.1 remains partial because the test engagement sits at the outreach phase</w:t>
       </w:r>
       <w:r>
         <w:t xml:space="preserve"> </w:t>
       </w:r>
       <w:r>
-        <w:t xml:space="preserve">account with a completed engagement or a live meeting, and zoom-level sweeps I</w:t>
+        <w:t xml:space="preserve">and cannot reach the assessment state. The layout was measured on a replica</w:t>
       </w:r>
       <w:r>
         <w:t xml:space="preserve"> </w:t>
       </w:r>
       <w:r>
-        <w:t xml:space="preserve">did not run to the full four steps. Neither group blocks the fixes; both would</w:t>
+        <w:t xml:space="preserve">built from the same Carbon classes and the same stylesheet the page uses, with</w:t>
       </w:r>
       <w:r>
         <w:t xml:space="preserve"> </w:t>
       </w:r>
       <w:r>
-        <w:t xml:space="preserve">strengthen the evidence.</w:t>
+        <w:t xml:space="preserve">the real feedback text, so the figures are real — but nobody has seen the page</w:t>
+      </w:r>
+      <w:r>
+        <w:t xml:space="preserve"> </w:t>
+      </w:r>
+      <w:r>
+        <w:t xml:space="preserve">itself with real data. That is the one thing worth a second pair of eyes before</w:t>
+      </w:r>
+      <w:r>
+        <w:t xml:space="preserve"> </w:t>
+      </w:r>
+      <w:r>
+        <w:t xml:space="preserve">this merges.</w:t>
       </w:r>
     </w:p>
     <w:bookmarkEnd w:id="27"/>
+    <w:bookmarkStart w:id="28" w:name="what-the-verification-work-turned-up"/>
+    <w:p>
+      <w:pPr>
+        <w:pStyle w:val="Heading2"/>
+      </w:pPr>
+      <w:r>
+        <w:t xml:space="preserve">What the verification work turned up</w:t>
+      </w:r>
+    </w:p>
+    <w:p>
+      <w:pPr>
+        <w:pStyle w:val="FirstParagraph"/>
+      </w:pPr>
+      <w:r>
+        <w:t xml:space="preserve">Two findings came out of finishing the tasks rather than out of the original</w:t>
+      </w:r>
+      <w:r>
+        <w:t xml:space="preserve"> </w:t>
+      </w:r>
+      <w:r>
+        <w:t xml:space="preserve">defect list.</w:t>
+      </w:r>
+    </w:p>
+    <w:p>
+      <w:pPr>
+        <w:pStyle w:val="BodyText"/>
+      </w:pPr>
+      <w:r>
+        <w:rPr>
+          <w:bCs/>
+          <w:b/>
+        </w:rPr>
+        <w:t xml:space="preserve">A regression I had introduced (N01.8).</w:t>
+      </w:r>
+      <w:r>
+        <w:t xml:space="preserve"> </w:t>
+      </w:r>
+      <w:r>
+        <w:rPr>
+          <w:rStyle w:val="VerbatimChar"/>
+        </w:rPr>
+        <w:t xml:space="preserve">turns</w:t>
+      </w:r>
+      <w:r>
+        <w:t xml:space="preserve"> </w:t>
+      </w:r>
+      <w:r>
+        <w:t xml:space="preserve">stays empty until the first</w:t>
+      </w:r>
+      <w:r>
+        <w:t xml:space="preserve"> </w:t>
+      </w:r>
+      <w:r>
+        <w:t xml:space="preserve">exchange is persisted, so on the learner’s very first message the placeholder</w:t>
+      </w:r>
+      <w:r>
+        <w:t xml:space="preserve"> </w:t>
+      </w:r>
+      <w:r>
+        <w:t xml:space="preserve">was still rendering beside their own pending and streaming bubbles. My</w:t>
+      </w:r>
+      <w:r>
+        <w:t xml:space="preserve"> </w:t>
+      </w:r>
+      <w:r>
+        <w:t xml:space="preserve">centring rule would then have laid them out side by side. The placeholder now</w:t>
+      </w:r>
+      <w:r>
+        <w:t xml:space="preserve"> </w:t>
+      </w:r>
+      <w:r>
+        <w:t xml:space="preserve">hides as soon as a message is in flight, the centring is column-safe, and the</w:t>
+      </w:r>
+      <w:r>
+        <w:t xml:space="preserve"> </w:t>
+      </w:r>
+      <w:r>
+        <w:t xml:space="preserve">rule is covered by four unit tests so it cannot come back silently.</w:t>
+      </w:r>
+    </w:p>
+    <w:p>
+      <w:pPr>
+        <w:pStyle w:val="BodyText"/>
+      </w:pPr>
+      <w:r>
+        <w:rPr>
+          <w:bCs/>
+          <w:b/>
+        </w:rPr>
+        <w:t xml:space="preserve">The card edge is faint across the whole product (N04.6).</w:t>
+      </w:r>
+      <w:r>
+        <w:t xml:space="preserve"> </w:t>
+      </w:r>
+      <w:r>
+        <w:t xml:space="preserve">Measured against</w:t>
+      </w:r>
+      <w:r>
+        <w:t xml:space="preserve"> </w:t>
+      </w:r>
+      <w:r>
+        <w:t xml:space="preserve">the tile background of</w:t>
+      </w:r>
+      <w:r>
+        <w:t xml:space="preserve"> </w:t>
+      </w:r>
+      <w:r>
+        <w:rPr>
+          <w:rStyle w:val="VerbatimChar"/>
+        </w:rPr>
+        <w:t xml:space="preserve">#f4f4f4</w:t>
+      </w:r>
+      <w:r>
+        <w:t xml:space="preserve">:</w:t>
+      </w:r>
+      <w:r>
+        <w:t xml:space="preserve"> </w:t>
+      </w:r>
+      <w:r>
+        <w:rPr>
+          <w:rStyle w:val="VerbatimChar"/>
+        </w:rPr>
+        <w:t xml:space="preserve">$border-subtle</w:t>
+      </w:r>
+      <w:r>
+        <w:t xml:space="preserve"> </w:t>
+      </w:r>
+      <w:r>
+        <w:t xml:space="preserve">gives 1.31:1 and</w:t>
+      </w:r>
+      <w:r>
+        <w:t xml:space="preserve"> </w:t>
+      </w:r>
+      <w:r>
+        <w:rPr>
+          <w:rStyle w:val="VerbatimChar"/>
+        </w:rPr>
+        <w:t xml:space="preserve">$border-strong-01</w:t>
+      </w:r>
+      <w:r>
+        <w:t xml:space="preserve"> </w:t>
+      </w:r>
+      <w:r>
+        <w:t xml:space="preserve">gives 3.02:1, which is the WCAG 1.4.11 threshold for</w:t>
+      </w:r>
+      <w:r>
+        <w:t xml:space="preserve"> </w:t>
+      </w:r>
+      <w:r>
+        <w:t xml:space="preserve">non-text contrast. The assessment page now uses the stronger token, because a</w:t>
+      </w:r>
+      <w:r>
+        <w:t xml:space="preserve"> </w:t>
+      </w:r>
+      <w:r>
+        <w:t xml:space="preserve">line nobody can see does not answer a request for a line. Every other card in</w:t>
+      </w:r>
+      <w:r>
+        <w:t xml:space="preserve"> </w:t>
+      </w:r>
+      <w:r>
+        <w:t xml:space="preserve">the product sits at roughly 1.15:1 against the same background. That is a</w:t>
+      </w:r>
+      <w:r>
+        <w:t xml:space="preserve"> </w:t>
+      </w:r>
+      <w:r>
+        <w:t xml:space="preserve">design-system decision rather than something to settle on one page, and it is</w:t>
+      </w:r>
+      <w:r>
+        <w:t xml:space="preserve"> </w:t>
+      </w:r>
+      <w:r>
+        <w:t xml:space="preserve">handed back rather than changed unilaterally.</w:t>
+      </w:r>
+    </w:p>
+    <w:p>
+      <w:pPr>
+        <w:pStyle w:val="BodyText"/>
+      </w:pPr>
+      <w:r>
+        <w:rPr>
+          <w:bCs/>
+          <w:b/>
+        </w:rPr>
+        <w:t xml:space="preserve">One thing deliberately not changed (N05.7).</w:t>
+      </w:r>
+      <w:r>
+        <w:t xml:space="preserve"> </w:t>
+      </w:r>
+      <w:r>
+        <w:t xml:space="preserve">At md and sm the composer’s</w:t>
+      </w:r>
+      <w:r>
+        <w:t xml:space="preserve"> </w:t>
+      </w:r>
+      <w:r>
+        <w:t xml:space="preserve">vertical rhythm measures 32 / 32 / 36 px rather than a single value, because it</w:t>
+      </w:r>
+      <w:r>
+        <w:t xml:space="preserve"> </w:t>
+      </w:r>
+      <w:r>
+        <w:t xml:space="preserve">is built from four separate margins (8, 12, 8 and 16px) instead of one scale.</w:t>
+      </w:r>
+      <w:r>
+        <w:t xml:space="preserve"> </w:t>
+      </w:r>
+      <w:r>
+        <w:t xml:space="preserve">Four pixels at tablet width is below the threshold anyone would report, and</w:t>
+      </w:r>
+      <w:r>
+        <w:t xml:space="preserve"> </w:t>
+      </w:r>
+      <w:r>
+        <w:t xml:space="preserve">replacing the rhythm risks a visible regression at desktop where it currently</w:t>
+      </w:r>
+      <w:r>
+        <w:t xml:space="preserve"> </w:t>
+      </w:r>
+      <w:r>
+        <w:t xml:space="preserve">measures uniform. Recorded rather than churned.</w:t>
+      </w:r>
+    </w:p>
+    <w:bookmarkEnd w:id="28"/>
     <w:sectPr/>
   </w:body>
 </w:document>

</xml_diff>

<commit_message>
Verify four fixes on the real pages instead of replicas
Rather than leave these resting on replicas, the engagement was driven forward
to reach the states they needed: an outreach email written against the rubric
and accepted by the client, then a meeting plan taken to 100/100 to open the
live meeting.

That moved four verifications onto the real pages — the live meeting placeholder
centres to within 0px, the monogram holds 52x52, the meeting-secured panel sits
at 146px around 96px of content, and the stepper stays one row.

The playthrough stopped at the live meeting: messages fail because the STOMP
WebSocket does not connect through the local dev proxy. Local infrastructure,
unrelated to these fixes, but it puts the proposal and assessment stages out of
reach, so N03.1 stays partial.
</commit_message>
<xml_diff>
--- a/docs/architecture/UX_ROUND3_TASK_BREAKDOWN.docx
+++ b/docs/architecture/UX_ROUND3_TASK_BREAKDOWN.docx
@@ -402,7 +402,14 @@
               <w:jc w:val="left"/>
             </w:pPr>
             <w:r>
-              <w:t xml:space="preserve">Replica of the transcript panel</w:t>
+              <w:rPr>
+                <w:bCs/>
+                <w:b/>
+              </w:rPr>
+              <w:t xml:space="preserve">On the live meeting page</w:t>
+            </w:r>
+            <w:r>
+              <w:t xml:space="preserve">, reached by playing the simulation</w:t>
             </w:r>
           </w:p>
         </w:tc>
@@ -555,16 +562,7 @@
               <w:jc w:val="left"/>
             </w:pPr>
             <w:r>
-              <w:rPr>
-                <w:rStyle w:val="VerbatimChar"/>
-              </w:rPr>
-              <w:t xml:space="preserve">:has()</w:t>
-            </w:r>
-            <w:r>
-              <w:t xml:space="preserve"> </w:t>
-            </w:r>
-            <w:r>
-              <w:t xml:space="preserve">scoped rule on the viewport</w:t>
+              <w:t xml:space="preserve">Live page: viewport centre 84px, text centre 84px, offset 0</w:t>
             </w:r>
           </w:p>
         </w:tc>
@@ -772,17 +770,7 @@
               <w:jc w:val="left"/>
             </w:pPr>
             <w:r>
-              <w:rPr>
-                <w:bCs/>
-                <w:b/>
-              </w:rPr>
-              <w:t xml:space="preserve">Found a regression I had introduced</w:t>
-            </w:r>
-            <w:r>
-              <w:t xml:space="preserve"> </w:t>
-            </w:r>
-            <w:r>
-              <w:t xml:space="preserve">— see note</w:t>
+              <w:t xml:space="preserve">Regression found and fixed; covered by four unit tests</w:t>
             </w:r>
           </w:p>
         </w:tc>
@@ -1203,7 +1191,7 @@
               <w:jc w:val="left"/>
             </w:pPr>
             <w:r>
-              <w:t xml:space="preserve">52 × 52, ratio 1.000</w:t>
+              <w:t xml:space="preserve">52 × 52 ratio 1.000, confirmed again on the live page</w:t>
             </w:r>
           </w:p>
         </w:tc>
@@ -2542,7 +2530,14 @@
               <w:jc w:val="left"/>
             </w:pPr>
             <w:r>
-              <w:t xml:space="preserve">Fixed the empty box in the meeting-secured state instead</w:t>
+              <w:rPr>
+                <w:bCs/>
+                <w:b/>
+              </w:rPr>
+              <w:t xml:space="preserve">Verified live</w:t>
+            </w:r>
+            <w:r>
+              <w:t xml:space="preserve">: panel 146px around 96px of content, 50px of padding</w:t>
             </w:r>
           </w:p>
         </w:tc>
@@ -3702,13 +3697,87 @@
         <w:pStyle w:val="BodyText"/>
       </w:pPr>
       <w:r>
-        <w:t xml:space="preserve">N03.1 remains partial because the test engagement sits at the outreach phase</w:t>
+        <w:t xml:space="preserve">N03.1 remains partial. The engagement was driven forward specifically to close</w:t>
       </w:r>
       <w:r>
         <w:t xml:space="preserve"> </w:t>
       </w:r>
       <w:r>
-        <w:t xml:space="preserve">and cannot reach the assessment state. The layout was measured on a replica</w:t>
+        <w:t xml:space="preserve">these gaps — a fresh outreach email was written against the rubric, accepted by</w:t>
+      </w:r>
+      <w:r>
+        <w:t xml:space="preserve"> </w:t>
+      </w:r>
+      <w:r>
+        <w:t xml:space="preserve">the client, and the meeting plan was taken to 100/100 to open the live meeting.</w:t>
+      </w:r>
+      <w:r>
+        <w:t xml:space="preserve"> </w:t>
+      </w:r>
+      <w:r>
+        <w:t xml:space="preserve">That closed four verifications that had only been done on replicas: the live</w:t>
+      </w:r>
+      <w:r>
+        <w:t xml:space="preserve"> </w:t>
+      </w:r>
+      <w:r>
+        <w:t xml:space="preserve">meeting centring, the monogram, the meeting-secured panel and the stepper are</w:t>
+      </w:r>
+      <w:r>
+        <w:t xml:space="preserve"> </w:t>
+      </w:r>
+      <w:r>
+        <w:t xml:space="preserve">now all measured on the real pages.</w:t>
+      </w:r>
+    </w:p>
+    <w:p>
+      <w:pPr>
+        <w:pStyle w:val="BodyText"/>
+      </w:pPr>
+      <w:r>
+        <w:t xml:space="preserve">The playthrough stopped at the live meeting: messages fail with</w:t>
+      </w:r>
+      <w:r>
+        <w:t xml:space="preserve"> </w:t>
+      </w:r>
+      <w:r>
+        <w:t xml:space="preserve">“</w:t>
+      </w:r>
+      <w:r>
+        <w:t xml:space="preserve">Not connected</w:t>
+      </w:r>
+      <w:r>
+        <w:t xml:space="preserve"> </w:t>
+      </w:r>
+      <w:r>
+        <w:t xml:space="preserve">to the live meeting channel yet</w:t>
+      </w:r>
+      <w:r>
+        <w:t xml:space="preserve">”</w:t>
+      </w:r>
+      <w:r>
+        <w:t xml:space="preserve"> </w:t>
+      </w:r>
+      <w:r>
+        <w:t xml:space="preserve">because the STOMP WebSocket does not connect</w:t>
+      </w:r>
+      <w:r>
+        <w:t xml:space="preserve"> </w:t>
+      </w:r>
+      <w:r>
+        <w:t xml:space="preserve">through the local dev proxy. That is a local infrastructure problem unrelated</w:t>
+      </w:r>
+      <w:r>
+        <w:t xml:space="preserve"> </w:t>
+      </w:r>
+      <w:r>
+        <w:t xml:space="preserve">to these fixes, but without it the meeting cannot complete, so the proposal and</w:t>
+      </w:r>
+      <w:r>
+        <w:t xml:space="preserve"> </w:t>
+      </w:r>
+      <w:r>
+        <w:t xml:space="preserve">assessment stages stay out of reach. The layout was measured on a replica</w:t>
       </w:r>
       <w:r>
         <w:t xml:space="preserve"> </w:t>

</xml_diff>

<commit_message>
Record two findings from the playthrough
The coach-mark tour opens over the Live Client Meeting and covers the
conversation panel, including the placeholder this round was fixing. Left
alone because it belongs to the coach-mark work, but it needs an owner.

The local dev proxy cannot carry the STOMP connection, so a local playthrough
stops at the live meeting. Recorded with what was already ruled out so nobody
repeats the diagnosis.
</commit_message>
<xml_diff>
--- a/docs/architecture/UX_ROUND3_TASK_BREAKDOWN.docx
+++ b/docs/architecture/UX_ROUND3_TASK_BREAKDOWN.docx
@@ -3979,6 +3979,141 @@
       </w:r>
       <w:r>
         <w:t xml:space="preserve">handed back rather than changed unilaterally.</w:t>
+      </w:r>
+    </w:p>
+    <w:p>
+      <w:pPr>
+        <w:pStyle w:val="BodyText"/>
+      </w:pPr>
+      <w:r>
+        <w:rPr>
+          <w:bCs/>
+          <w:b/>
+        </w:rPr>
+        <w:t xml:space="preserve">A new defect found while playing through, not on Christine’s list.</w:t>
+      </w:r>
+      <w:r>
+        <w:t xml:space="preserve"> </w:t>
+      </w:r>
+      <w:r>
+        <w:t xml:space="preserve">The</w:t>
+      </w:r>
+      <w:r>
+        <w:t xml:space="preserve"> </w:t>
+      </w:r>
+      <w:r>
+        <w:t xml:space="preserve">coach-mark tour opens over the Live Client Meeting and covers the conversation</w:t>
+      </w:r>
+      <w:r>
+        <w:t xml:space="preserve"> </w:t>
+      </w:r>
+      <w:r>
+        <w:t xml:space="preserve">panel, including the placeholder this round was fixing. It is not touched here</w:t>
+      </w:r>
+      <w:r>
+        <w:t xml:space="preserve"> </w:t>
+      </w:r>
+      <w:r>
+        <w:t xml:space="preserve">because it belongs to the coach-mark work rather than to these six defects, but</w:t>
+      </w:r>
+      <w:r>
+        <w:t xml:space="preserve"> </w:t>
+      </w:r>
+      <w:r>
+        <w:t xml:space="preserve">it is worth someone owning.</w:t>
+      </w:r>
+    </w:p>
+    <w:p>
+      <w:pPr>
+        <w:pStyle w:val="BodyText"/>
+      </w:pPr>
+      <w:r>
+        <w:rPr>
+          <w:bCs/>
+          <w:b/>
+        </w:rPr>
+        <w:t xml:space="preserve">A local blocker, recorded so nobody repeats the diagnosis.</w:t>
+      </w:r>
+      <w:r>
+        <w:t xml:space="preserve"> </w:t>
+      </w:r>
+      <w:r>
+        <w:t xml:space="preserve">The live meeting</w:t>
+      </w:r>
+      <w:r>
+        <w:t xml:space="preserve"> </w:t>
+      </w:r>
+      <w:r>
+        <w:t xml:space="preserve">cannot send messages through the local dev proxy:</w:t>
+      </w:r>
+      <w:r>
+        <w:t xml:space="preserve"> </w:t>
+      </w:r>
+      <w:r>
+        <w:t xml:space="preserve">“</w:t>
+      </w:r>
+      <w:r>
+        <w:t xml:space="preserve">Not connected to the live</w:t>
+      </w:r>
+      <w:r>
+        <w:t xml:space="preserve"> </w:t>
+      </w:r>
+      <w:r>
+        <w:t xml:space="preserve">meeting channel yet</w:t>
+      </w:r>
+      <w:r>
+        <w:t xml:space="preserve">”</w:t>
+      </w:r>
+      <w:r>
+        <w:t xml:space="preserve">. The</w:t>
+      </w:r>
+      <w:r>
+        <w:t xml:space="preserve"> </w:t>
+      </w:r>
+      <w:r>
+        <w:rPr>
+          <w:rStyle w:val="VerbatimChar"/>
+        </w:rPr>
+        <w:t xml:space="preserve">/ws</w:t>
+      </w:r>
+      <w:r>
+        <w:t xml:space="preserve"> </w:t>
+      </w:r>
+      <w:r>
+        <w:t xml:space="preserve">proxy already declares</w:t>
+      </w:r>
+      <w:r>
+        <w:t xml:space="preserve"> </w:t>
+      </w:r>
+      <w:r>
+        <w:rPr>
+          <w:rStyle w:val="VerbatimChar"/>
+        </w:rPr>
+        <w:t xml:space="preserve">ws: true</w:t>
+      </w:r>
+      <w:r>
+        <w:t xml:space="preserve"> </w:t>
+      </w:r>
+      <w:r>
+        <w:t xml:space="preserve">and the proxy</w:t>
+      </w:r>
+      <w:r>
+        <w:t xml:space="preserve"> </w:t>
+      </w:r>
+      <w:r>
+        <w:t xml:space="preserve">log shows no errors, so the STOMP CONNECT is failing somewhere past the</w:t>
+      </w:r>
+      <w:r>
+        <w:t xml:space="preserve"> </w:t>
+      </w:r>
+      <w:r>
+        <w:t xml:space="preserve">upgrade. Unrelated to these fixes, but it is what stops a local playthrough</w:t>
+      </w:r>
+      <w:r>
+        <w:t xml:space="preserve"> </w:t>
+      </w:r>
+      <w:r>
+        <w:t xml:space="preserve">reaching the proposal and assessment stages.</w:t>
       </w:r>
     </w:p>
     <w:p>

</xml_diff>